<commit_message>
first 5 tasks main
</commit_message>
<xml_diff>
--- a/Report/2aa4de9e-c8f9-4ae4-b81c-2377e38a68d8-TFf0336339-45a6-4a3e-812f-7918ef210f4f_wac.docx
+++ b/Report/2aa4de9e-c8f9-4ae4-b81c-2377e38a68d8-TFf0336339-45a6-4a3e-812f-7918ef210f4f_wac.docx
@@ -2651,6 +2651,451 @@
         </w:rPr>
         <w:t>”.Let’s code it together.</w:t>
       </w:r>
+    </w:p>
+    <w:p>
+      <w:pPr>
+        <w:numPr>
+          <w:ilvl w:val="0"/>
+          <w:numId w:val="11"/>
+        </w:numPr>
+        <w:tabs>
+          <w:tab w:val="clear" w:pos="420"/>
+        </w:tabs>
+        <w:spacing w:before="160" w:after="80" w:line="240" w:lineRule="auto"/>
+        <w:ind w:left="420" w:leftChars="0" w:hanging="420" w:firstLineChars="0"/>
+        <w:jc w:val="center"/>
+        <w:rPr>
+          <w:rFonts w:hint="default" w:ascii="Cambria" w:hAnsi="Cambria" w:cs="Cambria"/>
+          <w:sz w:val="32"/>
+          <w:szCs w:val="32"/>
+          <w:lang w:val="en-CA"/>
+        </w:rPr>
+      </w:pPr>
+      <w:r>
+        <w:drawing>
+          <wp:inline distT="0" distB="0" distL="114300" distR="114300">
+            <wp:extent cx="6237605" cy="4846955"/>
+            <wp:effectExtent l="0" t="0" r="10795" b="14605"/>
+            <wp:docPr id="8" name="Picture 8"/>
+            <wp:cNvGraphicFramePr>
+              <a:graphicFrameLocks xmlns:a="http://schemas.openxmlformats.org/drawingml/2006/main" noChangeAspect="1"/>
+            </wp:cNvGraphicFramePr>
+            <a:graphic xmlns:a="http://schemas.openxmlformats.org/drawingml/2006/main">
+              <a:graphicData uri="http://schemas.openxmlformats.org/drawingml/2006/picture">
+                <pic:pic xmlns:pic="http://schemas.openxmlformats.org/drawingml/2006/picture">
+                  <pic:nvPicPr>
+                    <pic:cNvPr id="8" name="Picture 8"/>
+                    <pic:cNvPicPr>
+                      <a:picLocks noChangeAspect="1"/>
+                    </pic:cNvPicPr>
+                  </pic:nvPicPr>
+                  <pic:blipFill>
+                    <a:blip r:embed="rId12"/>
+                    <a:stretch>
+                      <a:fillRect/>
+                    </a:stretch>
+                  </pic:blipFill>
+                  <pic:spPr>
+                    <a:xfrm>
+                      <a:off x="0" y="0"/>
+                      <a:ext cx="6237605" cy="4846955"/>
+                    </a:xfrm>
+                    <a:prstGeom prst="rect">
+                      <a:avLst/>
+                    </a:prstGeom>
+                    <a:noFill/>
+                    <a:ln>
+                      <a:noFill/>
+                    </a:ln>
+                  </pic:spPr>
+                </pic:pic>
+              </a:graphicData>
+            </a:graphic>
+          </wp:inline>
+        </w:drawing>
+      </w:r>
+    </w:p>
+    <w:p>
+      <w:pPr>
+        <w:numPr>
+          <w:numId w:val="0"/>
+        </w:numPr>
+        <w:spacing w:before="160" w:after="80" w:line="240" w:lineRule="auto"/>
+        <w:jc w:val="left"/>
+        <w:rPr>
+          <w:rFonts w:hint="default" w:ascii="Cambria" w:hAnsi="Cambria" w:cs="Cambria"/>
+          <w:sz w:val="32"/>
+          <w:szCs w:val="32"/>
+          <w:lang w:val="en-CA"/>
+        </w:rPr>
+      </w:pPr>
+      <w:r>
+        <w:drawing>
+          <wp:inline distT="0" distB="0" distL="114300" distR="114300">
+            <wp:extent cx="5942965" cy="635000"/>
+            <wp:effectExtent l="0" t="0" r="635" b="5080"/>
+            <wp:docPr id="9" name="Picture 9"/>
+            <wp:cNvGraphicFramePr>
+              <a:graphicFrameLocks xmlns:a="http://schemas.openxmlformats.org/drawingml/2006/main" noChangeAspect="1"/>
+            </wp:cNvGraphicFramePr>
+            <a:graphic xmlns:a="http://schemas.openxmlformats.org/drawingml/2006/main">
+              <a:graphicData uri="http://schemas.openxmlformats.org/drawingml/2006/picture">
+                <pic:pic xmlns:pic="http://schemas.openxmlformats.org/drawingml/2006/picture">
+                  <pic:nvPicPr>
+                    <pic:cNvPr id="9" name="Picture 9"/>
+                    <pic:cNvPicPr>
+                      <a:picLocks noChangeAspect="1"/>
+                    </pic:cNvPicPr>
+                  </pic:nvPicPr>
+                  <pic:blipFill>
+                    <a:blip r:embed="rId13"/>
+                    <a:stretch>
+                      <a:fillRect/>
+                    </a:stretch>
+                  </pic:blipFill>
+                  <pic:spPr>
+                    <a:xfrm>
+                      <a:off x="0" y="0"/>
+                      <a:ext cx="5942965" cy="635000"/>
+                    </a:xfrm>
+                    <a:prstGeom prst="rect">
+                      <a:avLst/>
+                    </a:prstGeom>
+                    <a:noFill/>
+                    <a:ln>
+                      <a:noFill/>
+                    </a:ln>
+                  </pic:spPr>
+                </pic:pic>
+              </a:graphicData>
+            </a:graphic>
+          </wp:inline>
+        </w:drawing>
+      </w:r>
+    </w:p>
+    <w:p>
+      <w:pPr>
+        <w:numPr>
+          <w:ilvl w:val="0"/>
+          <w:numId w:val="11"/>
+        </w:numPr>
+        <w:tabs>
+          <w:tab w:val="clear" w:pos="420"/>
+        </w:tabs>
+        <w:spacing w:before="160" w:after="80" w:line="240" w:lineRule="auto"/>
+        <w:ind w:left="420" w:leftChars="0" w:hanging="420" w:firstLineChars="0"/>
+        <w:jc w:val="left"/>
+        <w:rPr>
+          <w:rFonts w:hint="default" w:ascii="Cambria" w:hAnsi="Cambria" w:cs="Cambria"/>
+          <w:sz w:val="32"/>
+          <w:szCs w:val="32"/>
+          <w:lang w:val="en-CA"/>
+        </w:rPr>
+      </w:pPr>
+      <w:r>
+        <w:rPr>
+          <w:rFonts w:hint="default" w:ascii="Cambria" w:hAnsi="Cambria" w:cs="Cambria"/>
+          <w:sz w:val="32"/>
+          <w:szCs w:val="32"/>
+          <w:lang w:val="en-CA"/>
+        </w:rPr>
+        <w:t>In our code , we have added kind of technquies such as SPMD .</w:t>
+      </w:r>
+    </w:p>
+    <w:p>
+      <w:pPr>
+        <w:numPr>
+          <w:numId w:val="0"/>
+        </w:numPr>
+        <w:spacing w:before="160" w:after="80" w:line="240" w:lineRule="auto"/>
+        <w:ind w:leftChars="0"/>
+        <w:jc w:val="left"/>
+        <w:rPr>
+          <w:rFonts w:hint="default" w:ascii="Cambria" w:hAnsi="Cambria" w:cs="Cambria"/>
+          <w:sz w:val="32"/>
+          <w:szCs w:val="32"/>
+          <w:lang w:val="en-CA"/>
+        </w:rPr>
+      </w:pPr>
+      <w:r>
+        <w:rPr>
+          <w:rFonts w:hint="default" w:ascii="Cambria" w:hAnsi="Cambria" w:cs="Cambria"/>
+          <w:sz w:val="32"/>
+          <w:szCs w:val="32"/>
+          <w:lang w:val="en-CA"/>
+        </w:rPr>
+        <w:t>In our code , we created an array to store each cacluation of id related to our thread cyclic distribution.Also we have avoided our race condtion that leads to wrong answers!.</w:t>
+      </w:r>
+    </w:p>
+    <w:p>
+      <w:pPr>
+        <w:numPr>
+          <w:numId w:val="0"/>
+        </w:numPr>
+        <w:spacing w:before="160" w:after="80" w:line="240" w:lineRule="auto"/>
+        <w:ind w:leftChars="0"/>
+        <w:jc w:val="left"/>
+        <w:rPr>
+          <w:rFonts w:hint="default" w:ascii="Cambria" w:hAnsi="Cambria" w:cs="Cambria"/>
+          <w:sz w:val="32"/>
+          <w:szCs w:val="32"/>
+          <w:lang w:val="en-CA"/>
+        </w:rPr>
+      </w:pPr>
+    </w:p>
+    <w:p>
+      <w:pPr>
+        <w:numPr>
+          <w:ilvl w:val="0"/>
+          <w:numId w:val="11"/>
+        </w:numPr>
+        <w:tabs>
+          <w:tab w:val="clear" w:pos="420"/>
+        </w:tabs>
+        <w:spacing w:before="160" w:after="80" w:line="240" w:lineRule="auto"/>
+        <w:ind w:left="420" w:leftChars="0" w:hanging="420" w:firstLineChars="0"/>
+        <w:jc w:val="left"/>
+        <w:rPr>
+          <w:rFonts w:hint="default" w:ascii="Cambria" w:hAnsi="Cambria" w:cs="Cambria"/>
+          <w:sz w:val="32"/>
+          <w:szCs w:val="32"/>
+          <w:lang w:val="en-CA"/>
+        </w:rPr>
+      </w:pPr>
+      <w:r>
+        <w:rPr>
+          <w:rFonts w:hint="default" w:ascii="Cambria" w:hAnsi="Cambria" w:cs="Cambria"/>
+          <w:sz w:val="32"/>
+          <w:szCs w:val="32"/>
+          <w:lang w:val="en-CA"/>
+        </w:rPr>
+        <w:t>Although we achieved the target purpose , the optimal execution has not been found yet . That because of that concept of false sharing</w:t>
+      </w:r>
+    </w:p>
+    <w:p>
+      <w:pPr>
+        <w:numPr>
+          <w:ilvl w:val="0"/>
+          <w:numId w:val="12"/>
+        </w:numPr>
+        <w:spacing w:before="160" w:after="80" w:line="240" w:lineRule="auto"/>
+        <w:ind w:left="432" w:leftChars="0" w:hanging="432" w:firstLineChars="0"/>
+        <w:jc w:val="center"/>
+        <w:rPr>
+          <w:rFonts w:hint="default" w:ascii="Cambria" w:hAnsi="Cambria" w:cs="Cambria"/>
+          <w:sz w:val="44"/>
+          <w:szCs w:val="44"/>
+          <w:lang w:val="en-CA"/>
+        </w:rPr>
+      </w:pPr>
+      <w:r>
+        <w:rPr>
+          <w:rFonts w:hint="default" w:ascii="Cambria" w:hAnsi="Cambria" w:cs="Cambria"/>
+          <w:sz w:val="44"/>
+          <w:szCs w:val="44"/>
+          <w:lang w:val="en-CA"/>
+        </w:rPr>
+        <w:t>(ChallengingwithFalsesharing,Lecture2Slide56)</w:t>
+      </w:r>
+    </w:p>
+    <w:p>
+      <w:pPr>
+        <w:numPr>
+          <w:numId w:val="0"/>
+        </w:numPr>
+        <w:spacing w:before="160" w:after="80" w:line="240" w:lineRule="auto"/>
+        <w:jc w:val="left"/>
+        <w:rPr>
+          <w:rFonts w:hint="default" w:ascii="Cambria" w:hAnsi="Cambria" w:cs="Cambria"/>
+          <w:sz w:val="44"/>
+          <w:szCs w:val="44"/>
+          <w:lang w:val="en-CA"/>
+        </w:rPr>
+      </w:pPr>
+    </w:p>
+    <w:p>
+      <w:pPr>
+        <w:numPr>
+          <w:ilvl w:val="0"/>
+          <w:numId w:val="13"/>
+        </w:numPr>
+        <w:tabs>
+          <w:tab w:val="clear" w:pos="420"/>
+        </w:tabs>
+        <w:spacing w:before="160" w:after="80" w:line="240" w:lineRule="auto"/>
+        <w:ind w:left="420" w:leftChars="0" w:hanging="420" w:firstLineChars="0"/>
+        <w:jc w:val="left"/>
+        <w:rPr>
+          <w:rFonts w:hint="default" w:ascii="Cambria" w:hAnsi="Cambria" w:cs="Cambria"/>
+          <w:sz w:val="32"/>
+          <w:szCs w:val="32"/>
+          <w:lang w:val="en-CA"/>
+        </w:rPr>
+      </w:pPr>
+      <w:r>
+        <w:rPr>
+          <w:rFonts w:hint="default" w:ascii="Cambria" w:hAnsi="Cambria" w:cs="Cambria"/>
+          <w:sz w:val="32"/>
+          <w:szCs w:val="32"/>
+          <w:lang w:val="en-CA"/>
+        </w:rPr>
+        <w:t>Now after see the problem of caching , going to random access memory forward and backward and lack of time execution, We need to store most of information in cache in order to fast retrieval info.</w:t>
+      </w:r>
+    </w:p>
+    <w:p>
+      <w:pPr>
+        <w:numPr>
+          <w:ilvl w:val="0"/>
+          <w:numId w:val="13"/>
+        </w:numPr>
+        <w:tabs>
+          <w:tab w:val="clear" w:pos="420"/>
+        </w:tabs>
+        <w:spacing w:before="160" w:after="80" w:line="240" w:lineRule="auto"/>
+        <w:ind w:left="420" w:leftChars="0" w:hanging="420" w:firstLineChars="0"/>
+        <w:jc w:val="left"/>
+        <w:rPr>
+          <w:rFonts w:hint="default" w:ascii="Cambria" w:hAnsi="Cambria" w:cs="Cambria"/>
+          <w:sz w:val="32"/>
+          <w:szCs w:val="32"/>
+          <w:lang w:val="en-CA"/>
+        </w:rPr>
+      </w:pPr>
+      <w:r>
+        <w:rPr>
+          <w:rFonts w:hint="default" w:ascii="Cambria" w:hAnsi="Cambria" w:cs="Cambria"/>
+          <w:sz w:val="32"/>
+          <w:szCs w:val="32"/>
+          <w:lang w:val="en-CA"/>
+        </w:rPr>
+        <w:t xml:space="preserve">Let’s see our picture to understand </w:t>
+      </w:r>
+    </w:p>
+    <w:p>
+      <w:pPr>
+        <w:numPr>
+          <w:ilvl w:val="0"/>
+          <w:numId w:val="13"/>
+        </w:numPr>
+        <w:tabs>
+          <w:tab w:val="clear" w:pos="420"/>
+        </w:tabs>
+        <w:spacing w:before="160" w:after="80" w:line="240" w:lineRule="auto"/>
+        <w:ind w:left="420" w:leftChars="0" w:hanging="420" w:firstLineChars="0"/>
+        <w:jc w:val="left"/>
+        <w:rPr>
+          <w:rFonts w:hint="default" w:ascii="Cambria" w:hAnsi="Cambria" w:cs="Cambria"/>
+          <w:sz w:val="32"/>
+          <w:szCs w:val="32"/>
+          <w:lang w:val="en-CA"/>
+        </w:rPr>
+      </w:pPr>
+      <w:r>
+        <w:drawing>
+          <wp:inline distT="0" distB="0" distL="114300" distR="114300">
+            <wp:extent cx="5942330" cy="5501005"/>
+            <wp:effectExtent l="0" t="0" r="1270" b="635"/>
+            <wp:docPr id="10" name="Picture 10"/>
+            <wp:cNvGraphicFramePr>
+              <a:graphicFrameLocks xmlns:a="http://schemas.openxmlformats.org/drawingml/2006/main" noChangeAspect="1"/>
+            </wp:cNvGraphicFramePr>
+            <a:graphic xmlns:a="http://schemas.openxmlformats.org/drawingml/2006/main">
+              <a:graphicData uri="http://schemas.openxmlformats.org/drawingml/2006/picture">
+                <pic:pic xmlns:pic="http://schemas.openxmlformats.org/drawingml/2006/picture">
+                  <pic:nvPicPr>
+                    <pic:cNvPr id="10" name="Picture 10"/>
+                    <pic:cNvPicPr>
+                      <a:picLocks noChangeAspect="1"/>
+                    </pic:cNvPicPr>
+                  </pic:nvPicPr>
+                  <pic:blipFill>
+                    <a:blip r:embed="rId14"/>
+                    <a:stretch>
+                      <a:fillRect/>
+                    </a:stretch>
+                  </pic:blipFill>
+                  <pic:spPr>
+                    <a:xfrm>
+                      <a:off x="0" y="0"/>
+                      <a:ext cx="5942330" cy="5501005"/>
+                    </a:xfrm>
+                    <a:prstGeom prst="rect">
+                      <a:avLst/>
+                    </a:prstGeom>
+                    <a:noFill/>
+                    <a:ln>
+                      <a:noFill/>
+                    </a:ln>
+                  </pic:spPr>
+                </pic:pic>
+              </a:graphicData>
+            </a:graphic>
+          </wp:inline>
+        </w:drawing>
+      </w:r>
+    </w:p>
+    <w:p>
+      <w:pPr>
+        <w:numPr>
+          <w:ilvl w:val="0"/>
+          <w:numId w:val="13"/>
+        </w:numPr>
+        <w:tabs>
+          <w:tab w:val="clear" w:pos="420"/>
+        </w:tabs>
+        <w:spacing w:before="160" w:after="80" w:line="240" w:lineRule="auto"/>
+        <w:ind w:left="420" w:leftChars="0" w:hanging="420" w:firstLineChars="0"/>
+        <w:jc w:val="left"/>
+        <w:rPr>
+          <w:rFonts w:hint="default" w:ascii="Cambria" w:hAnsi="Cambria" w:cs="Cambria"/>
+          <w:sz w:val="32"/>
+          <w:szCs w:val="32"/>
+          <w:lang w:val="en-CA"/>
+        </w:rPr>
+      </w:pPr>
+      <w:r>
+        <w:drawing>
+          <wp:inline distT="0" distB="0" distL="114300" distR="114300">
+            <wp:extent cx="5942330" cy="747395"/>
+            <wp:effectExtent l="0" t="0" r="1270" b="14605"/>
+            <wp:docPr id="12" name="Picture 12"/>
+            <wp:cNvGraphicFramePr>
+              <a:graphicFrameLocks xmlns:a="http://schemas.openxmlformats.org/drawingml/2006/main" noChangeAspect="1"/>
+            </wp:cNvGraphicFramePr>
+            <a:graphic xmlns:a="http://schemas.openxmlformats.org/drawingml/2006/main">
+              <a:graphicData uri="http://schemas.openxmlformats.org/drawingml/2006/picture">
+                <pic:pic xmlns:pic="http://schemas.openxmlformats.org/drawingml/2006/picture">
+                  <pic:nvPicPr>
+                    <pic:cNvPr id="12" name="Picture 12"/>
+                    <pic:cNvPicPr>
+                      <a:picLocks noChangeAspect="1"/>
+                    </pic:cNvPicPr>
+                  </pic:nvPicPr>
+                  <pic:blipFill>
+                    <a:blip r:embed="rId15"/>
+                    <a:stretch>
+                      <a:fillRect/>
+                    </a:stretch>
+                  </pic:blipFill>
+                  <pic:spPr>
+                    <a:xfrm>
+                      <a:off x="0" y="0"/>
+                      <a:ext cx="5942330" cy="747395"/>
+                    </a:xfrm>
+                    <a:prstGeom prst="rect">
+                      <a:avLst/>
+                    </a:prstGeom>
+                    <a:noFill/>
+                    <a:ln>
+                      <a:noFill/>
+                    </a:ln>
+                  </pic:spPr>
+                </pic:pic>
+              </a:graphicData>
+            </a:graphic>
+          </wp:inline>
+        </w:drawing>
+      </w:r>
       <w:bookmarkStart w:id="0" w:name="_GoBack"/>
       <w:bookmarkEnd w:id="0"/>
     </w:p>
@@ -2773,115 +3218,7 @@
         <w:pStyle w:val="2"/>
       </w:pPr>
     </w:p>
-    <w:p>
-      <w:pPr>
-        <w:pStyle w:val="2"/>
-      </w:pPr>
-      <w:r>
-        <w:t>Executive summary</w:t>
-      </w:r>
-    </w:p>
-    <w:p>
-      <w:r>
-        <w:t>Consolidated Messenger closed Q1 2025 with record-breaking revenue growth, driven by expanded e-commerce partnerships and streamlined delivery operations. Revenue increased by 12% quarter-over-quarter, reaching $45 million. Operational efficiency improvements resulted in a 15% reduction in delivery times, enhancing customer satisfaction.</w:t>
-      </w:r>
-      <w:r>
-        <w:br w:type="textWrapping"/>
-      </w:r>
-    </w:p>
-    <w:p>
-      <w:pPr>
-        <w:pStyle w:val="2"/>
-      </w:pPr>
-      <w:r>
-        <w:t>Financial overview</w:t>
-      </w:r>
-    </w:p>
-    <w:p>
-      <w:r>
-        <w:t>Q1 revenue totaled $45 million, a 12% increase from the previous quarter. Net profit margins rose to 18%, attributed to cost optimization initiatives and increased delivery volume. Operating expenses were effectively managed, ensuring sustainable growth.</w:t>
-      </w:r>
-      <w:r>
-        <w:br w:type="textWrapping"/>
-      </w:r>
-    </w:p>
-    <w:p>
-      <w:pPr>
-        <w:pStyle w:val="2"/>
-      </w:pPr>
-      <w:r>
-        <w:t>Operational performance</w:t>
-      </w:r>
-    </w:p>
-    <w:p>
-      <w:r>
-        <w:t>Consolidated Messenger achieved a 15% reduction in delivery times by optimizing route planning and expanding its network of regional fulfillment centers. Customer satisfaction scores improved by 10%, reflecting the positive impact of these operational changes.</w:t>
-      </w:r>
-      <w:r>
-        <w:br w:type="textWrapping"/>
-      </w:r>
-    </w:p>
-    <w:p>
-      <w:pPr>
-        <w:pStyle w:val="2"/>
-      </w:pPr>
-      <w:r>
-        <w:t>Market analysis</w:t>
-      </w:r>
-    </w:p>
-    <w:p>
-      <w:r>
-        <w:t>The e-commerce industry experienced continued growth, with increased demand for last-mile delivery services. Competitors such as Express Shippers Ltd. and Platoterra Container Shipping expanded their footprints, but Consolidated Messenger maintained its market leadership by offering superior delivery speed and reliability.</w:t>
-      </w:r>
-      <w:r>
-        <w:br w:type="textWrapping"/>
-      </w:r>
-    </w:p>
-    <w:p>
-      <w:pPr>
-        <w:pStyle w:val="2"/>
-      </w:pPr>
-      <w:r>
-        <w:t>Challenges and risks</w:t>
-      </w:r>
-    </w:p>
-    <w:p>
-      <w:r>
-        <w:t>Rising fuel costs posed a potential challenge to maintaining profitability. However, the implementation of fleet optimization measures helped mitigate these costs. Labor shortages also presented a risk, but an enhanced recruitment strategy ensured operational continuity.</w:t>
-      </w:r>
-      <w:r>
-        <w:br w:type="textWrapping"/>
-      </w:r>
-    </w:p>
-    <w:p>
-      <w:pPr>
-        <w:pStyle w:val="2"/>
-      </w:pPr>
-      <w:r>
-        <w:t>Strategic initiatives and progress</w:t>
-      </w:r>
-    </w:p>
-    <w:p>
-      <w:r>
-        <w:t>Key initiatives included the deployment of AI-powered route optimization and the expansion of same-day delivery services. These initiatives contributed to the company’s improved operational efficiency and customer satisfaction.</w:t>
-      </w:r>
-      <w:r>
-        <w:br w:type="textWrapping"/>
-      </w:r>
-    </w:p>
-    <w:p>
-      <w:pPr>
-        <w:pStyle w:val="2"/>
-      </w:pPr>
-      <w:r>
-        <w:t>Recommendations and action plan</w:t>
-      </w:r>
-    </w:p>
-    <w:p>
-      <w:r>
-        <w:t>To sustain growth in the next quarter, Consolidated Messenger plans to invest in further automation of delivery processes. Additionally, strengthening partnerships with e-commerce platforms will expand the customer base and revenue streams.</w:t>
-      </w:r>
-    </w:p>
+    <w:p/>
     <w:sectPr>
       <w:pgSz w:w="12240" w:h="15840"/>
       <w:pgMar w:top="1440" w:right="1440" w:bottom="360" w:left="1440" w:header="720" w:footer="360" w:gutter="0"/>
@@ -3692,6 +4029,26 @@
     </w:lvl>
   </w:abstractNum>
   <w:abstractNum w:abstractNumId="10">
+    <w:nsid w:val="6962CE74"/>
+    <w:multiLevelType w:val="singleLevel"/>
+    <w:tmpl w:val="6962CE74"/>
+    <w:lvl w:ilvl="0" w:tentative="0">
+      <w:start w:val="1"/>
+      <w:numFmt w:val="bullet"/>
+      <w:lvlText w:val=""/>
+      <w:lvlJc w:val="left"/>
+      <w:pPr>
+        <w:tabs>
+          <w:tab w:val="left" w:pos="420"/>
+        </w:tabs>
+        <w:ind w:left="420" w:leftChars="0" w:hanging="420" w:firstLineChars="0"/>
+      </w:pPr>
+      <w:rPr>
+        <w:rFonts w:hint="default" w:ascii="Wingdings" w:hAnsi="Wingdings"/>
+      </w:rPr>
+    </w:lvl>
+  </w:abstractNum>
+  <w:abstractNum w:abstractNumId="11">
     <w:nsid w:val="6CC9D2AC"/>
     <w:multiLevelType w:val="multilevel"/>
     <w:tmpl w:val="6CC9D2AC"/>
@@ -3777,11 +4134,31 @@
       </w:pPr>
     </w:lvl>
   </w:abstractNum>
+  <w:abstractNum w:abstractNumId="12">
+    <w:nsid w:val="7579365C"/>
+    <w:multiLevelType w:val="singleLevel"/>
+    <w:tmpl w:val="7579365C"/>
+    <w:lvl w:ilvl="0" w:tentative="0">
+      <w:start w:val="4"/>
+      <w:numFmt w:val="decimal"/>
+      <w:lvlText w:val="%1."/>
+      <w:lvlJc w:val="left"/>
+      <w:pPr>
+        <w:tabs>
+          <w:tab w:val="left" w:pos="432"/>
+        </w:tabs>
+        <w:ind w:left="432" w:leftChars="0" w:hanging="432" w:firstLineChars="0"/>
+      </w:pPr>
+      <w:rPr>
+        <w:rFonts w:hint="default"/>
+      </w:rPr>
+    </w:lvl>
+  </w:abstractNum>
   <w:num w:numId="1">
     <w:abstractNumId w:val="9"/>
   </w:num>
   <w:num w:numId="2">
-    <w:abstractNumId w:val="10"/>
+    <w:abstractNumId w:val="11"/>
   </w:num>
   <w:num w:numId="3">
     <w:abstractNumId w:val="2"/>
@@ -3809,6 +4186,12 @@
   </w:num>
   <w:num w:numId="11">
     <w:abstractNumId w:val="6"/>
+  </w:num>
+  <w:num w:numId="12">
+    <w:abstractNumId w:val="12"/>
+  </w:num>
+  <w:num w:numId="13">
+    <w:abstractNumId w:val="10"/>
   </w:num>
 </w:numbering>
 </file>

</xml_diff>

<commit_message>
Donee report last edit
</commit_message>
<xml_diff>
--- a/Report/2aa4de9e-c8f9-4ae4-b81c-2377e38a68d8-TFf0336339-45a6-4a3e-812f-7918ef210f4f_wac.docx
+++ b/Report/2aa4de9e-c8f9-4ae4-b81c-2377e38a68d8-TFf0336339-45a6-4a3e-812f-7918ef210f4f_wac.docx
@@ -581,6 +581,36 @@
       <w:pPr>
         <w:pStyle w:val="44"/>
         <w:numPr>
+          <w:ilvl w:val="0"/>
+          <w:numId w:val="1"/>
+        </w:numPr>
+        <w:suppressLineNumbers w:val="0"/>
+        <w:bidi w:val="0"/>
+        <w:spacing w:before="160" w:beforeAutospacing="0" w:after="80" w:afterAutospacing="0" w:line="240" w:lineRule="auto"/>
+        <w:ind w:right="0"/>
+        <w:jc w:val="left"/>
+        <w:rPr>
+          <w:rFonts w:ascii="Cambria" w:hAnsi="Cambria" w:eastAsia="Cambria" w:cs="Cambria"/>
+          <w:sz w:val="40"/>
+          <w:szCs w:val="40"/>
+          <w:lang w:val="en-US"/>
+        </w:rPr>
+      </w:pPr>
+      <w:r>
+        <w:rPr>
+          <w:rFonts w:hint="default" w:ascii="Cambria" w:hAnsi="Cambria" w:eastAsia="Cambria" w:cs="Cambria"/>
+          <w:sz w:val="40"/>
+          <w:szCs w:val="40"/>
+          <w:lang w:val="en-GB"/>
+        </w:rPr>
+        <w:t>Locks</w:t>
+      </w:r>
+    </w:p>
+    <w:p>
+      <w:pPr>
+        <w:pStyle w:val="44"/>
+        <w:numPr>
+          <w:ilvl w:val="0"/>
           <w:numId w:val="0"/>
         </w:numPr>
         <w:suppressLineNumbers w:val="0"/>
@@ -609,6 +639,7 @@
       <w:pPr>
         <w:pStyle w:val="44"/>
         <w:numPr>
+          <w:ilvl w:val="0"/>
           <w:numId w:val="0"/>
         </w:numPr>
         <w:suppressLineNumbers w:val="0"/>
@@ -666,6 +697,7 @@
       <w:pPr>
         <w:pStyle w:val="44"/>
         <w:numPr>
+          <w:ilvl w:val="0"/>
           <w:numId w:val="0"/>
         </w:numPr>
         <w:suppressLineNumbers w:val="0"/>
@@ -4333,6 +4365,7 @@
     <w:p>
       <w:pPr>
         <w:numPr>
+          <w:ilvl w:val="0"/>
           <w:numId w:val="0"/>
         </w:numPr>
         <w:tabs>
@@ -4389,6 +4422,7 @@
     <w:p>
       <w:pPr>
         <w:numPr>
+          <w:ilvl w:val="0"/>
           <w:numId w:val="0"/>
         </w:numPr>
         <w:tabs>
@@ -4445,6 +4479,7 @@
     <w:p>
       <w:pPr>
         <w:numPr>
+          <w:ilvl w:val="0"/>
           <w:numId w:val="0"/>
         </w:numPr>
         <w:tabs>
@@ -4541,18 +4576,21 @@
           <w:rFonts w:hint="default" w:ascii="Cambria" w:hAnsi="Cambria" w:cs="Cambria"/>
           <w:sz w:val="32"/>
           <w:szCs w:val="32"/>
-          <w:lang w:val="en-CA"/>
-        </w:rPr>
-      </w:pPr>
-    </w:p>
-    <w:p>
-      <w:pPr>
-        <w:numPr>
-          <w:ilvl w:val="0"/>
-          <w:numId w:val="21"/>
-        </w:numPr>
-        <w:spacing w:before="160" w:after="80" w:line="240" w:lineRule="auto"/>
-        <w:ind w:left="432" w:leftChars="0" w:hanging="432" w:firstLineChars="0"/>
+        </w:rPr>
+      </w:pPr>
+    </w:p>
+    <w:p>
+      <w:pPr>
+        <w:numPr>
+          <w:ilvl w:val="0"/>
+          <w:numId w:val="24"/>
+        </w:numPr>
+        <w:tabs>
+          <w:tab w:val="left" w:pos="432"/>
+          <w:tab w:val="clear" w:pos="852"/>
+        </w:tabs>
+        <w:spacing w:before="160" w:after="80" w:line="240" w:lineRule="auto"/>
+        <w:ind w:left="852" w:leftChars="0" w:hanging="432" w:firstLineChars="0"/>
         <w:jc w:val="center"/>
         <w:rPr>
           <w:rFonts w:hint="default" w:ascii="Cambria" w:hAnsi="Cambria" w:cs="Cambria"/>
@@ -4560,7 +4598,6 @@
           <w:bCs/>
           <w:sz w:val="44"/>
           <w:szCs w:val="44"/>
-          <w:lang w:val="en-CA"/>
         </w:rPr>
       </w:pPr>
       <w:r>
@@ -4570,9 +4607,36 @@
           <w:bCs/>
           <w:sz w:val="44"/>
           <w:szCs w:val="44"/>
-          <w:lang w:val="en-CA"/>
-        </w:rPr>
-        <w:t>(Introductiontompi,Lecture3Slide90)</w:t>
+        </w:rPr>
+        <w:t>Simple Introduction to Locks in OpenMP</w:t>
+      </w:r>
+    </w:p>
+    <w:p>
+      <w:pPr>
+        <w:numPr>
+          <w:ilvl w:val="0"/>
+          <w:numId w:val="25"/>
+        </w:numPr>
+        <w:tabs>
+          <w:tab w:val="left" w:pos="432"/>
+          <w:tab w:val="clear" w:pos="420"/>
+        </w:tabs>
+        <w:spacing w:before="160" w:after="80" w:line="240" w:lineRule="auto"/>
+        <w:ind w:left="420" w:leftChars="0" w:hanging="420" w:firstLineChars="0"/>
+        <w:jc w:val="left"/>
+        <w:rPr>
+          <w:rFonts w:hint="default" w:ascii="Cambria" w:hAnsi="Cambria" w:cs="Cambria"/>
+          <w:sz w:val="32"/>
+          <w:szCs w:val="32"/>
+        </w:rPr>
+      </w:pPr>
+      <w:r>
+        <w:rPr>
+          <w:rFonts w:hint="default" w:ascii="Cambria" w:hAnsi="Cambria" w:cs="Cambria"/>
+          <w:sz w:val="32"/>
+          <w:szCs w:val="32"/>
+        </w:rPr>
+        <w:t>In OpenMP, a lock is a synchronization mechanism used to ensure that only one thread can access a critical section of code at a time. Locks are useful when multiple threads need to read or modify shared data, and we want to prevent race conditions. A thread must acquire the lock before entering the protected section and release it afterward, allowing other threads to access the shared resource. Unlike #pragma omp critical, locks give the programmer explicit control over when the lock is acquired and released.</w:t>
       </w:r>
     </w:p>
     <w:p>
@@ -4584,7 +4648,171 @@
           <w:tab w:val="left" w:pos="432"/>
         </w:tabs>
         <w:spacing w:before="160" w:after="80" w:line="240" w:lineRule="auto"/>
+        <w:ind w:leftChars="0"/>
+        <w:jc w:val="left"/>
+        <w:rPr>
+          <w:rFonts w:hint="default" w:ascii="Cambria" w:hAnsi="Cambria" w:cs="Cambria"/>
+          <w:sz w:val="32"/>
+          <w:szCs w:val="32"/>
+        </w:rPr>
+      </w:pPr>
+      <w:bookmarkStart w:id="0" w:name="_GoBack"/>
+      <w:bookmarkEnd w:id="0"/>
+    </w:p>
+    <w:p>
+      <w:pPr>
+        <w:numPr>
+          <w:ilvl w:val="0"/>
+          <w:numId w:val="25"/>
+        </w:numPr>
+        <w:tabs>
+          <w:tab w:val="left" w:pos="432"/>
+          <w:tab w:val="clear" w:pos="420"/>
+        </w:tabs>
+        <w:spacing w:before="160" w:after="80" w:line="240" w:lineRule="auto"/>
+        <w:ind w:left="420" w:leftChars="0" w:hanging="420" w:firstLineChars="0"/>
+        <w:jc w:val="left"/>
+        <w:rPr>
+          <w:rFonts w:hint="default" w:ascii="Cambria" w:hAnsi="Cambria" w:cs="Cambria"/>
+          <w:sz w:val="32"/>
+          <w:szCs w:val="32"/>
+        </w:rPr>
+      </w:pPr>
+      <w:r>
+        <w:drawing>
+          <wp:inline distT="0" distB="0" distL="114300" distR="114300">
+            <wp:extent cx="5937885" cy="2607310"/>
+            <wp:effectExtent l="0" t="0" r="5715" b="13970"/>
+            <wp:docPr id="22" name="Picture 1"/>
+            <wp:cNvGraphicFramePr>
+              <a:graphicFrameLocks xmlns:a="http://schemas.openxmlformats.org/drawingml/2006/main" noChangeAspect="1"/>
+            </wp:cNvGraphicFramePr>
+            <a:graphic xmlns:a="http://schemas.openxmlformats.org/drawingml/2006/main">
+              <a:graphicData uri="http://schemas.openxmlformats.org/drawingml/2006/picture">
+                <pic:pic xmlns:pic="http://schemas.openxmlformats.org/drawingml/2006/picture">
+                  <pic:nvPicPr>
+                    <pic:cNvPr id="22" name="Picture 1"/>
+                    <pic:cNvPicPr>
+                      <a:picLocks noChangeAspect="1"/>
+                    </pic:cNvPicPr>
+                  </pic:nvPicPr>
+                  <pic:blipFill>
+                    <a:blip r:embed="rId28"/>
+                    <a:stretch>
+                      <a:fillRect/>
+                    </a:stretch>
+                  </pic:blipFill>
+                  <pic:spPr>
+                    <a:xfrm>
+                      <a:off x="0" y="0"/>
+                      <a:ext cx="5937885" cy="2607310"/>
+                    </a:xfrm>
+                    <a:prstGeom prst="rect">
+                      <a:avLst/>
+                    </a:prstGeom>
+                    <a:noFill/>
+                    <a:ln>
+                      <a:noFill/>
+                    </a:ln>
+                  </pic:spPr>
+                </pic:pic>
+              </a:graphicData>
+            </a:graphic>
+          </wp:inline>
+        </w:drawing>
+      </w:r>
+    </w:p>
+    <w:p>
+      <w:pPr>
+        <w:numPr>
+          <w:ilvl w:val="0"/>
+          <w:numId w:val="25"/>
+        </w:numPr>
+        <w:tabs>
+          <w:tab w:val="left" w:pos="432"/>
+          <w:tab w:val="clear" w:pos="420"/>
+        </w:tabs>
+        <w:spacing w:before="160" w:after="80" w:line="240" w:lineRule="auto"/>
+        <w:ind w:left="420" w:leftChars="0" w:hanging="420" w:firstLineChars="0"/>
+        <w:jc w:val="left"/>
+        <w:rPr>
+          <w:rFonts w:hint="default" w:ascii="Cambria" w:hAnsi="Cambria" w:cs="Cambria"/>
+          <w:sz w:val="32"/>
+          <w:szCs w:val="32"/>
+        </w:rPr>
+      </w:pPr>
+      <w:r>
+        <w:drawing>
+          <wp:inline distT="0" distB="0" distL="114300" distR="114300">
+            <wp:extent cx="5938520" cy="405130"/>
+            <wp:effectExtent l="0" t="0" r="5080" b="6350"/>
+            <wp:docPr id="36" name="Picture 3"/>
+            <wp:cNvGraphicFramePr>
+              <a:graphicFrameLocks xmlns:a="http://schemas.openxmlformats.org/drawingml/2006/main" noChangeAspect="1"/>
+            </wp:cNvGraphicFramePr>
+            <a:graphic xmlns:a="http://schemas.openxmlformats.org/drawingml/2006/main">
+              <a:graphicData uri="http://schemas.openxmlformats.org/drawingml/2006/picture">
+                <pic:pic xmlns:pic="http://schemas.openxmlformats.org/drawingml/2006/picture">
+                  <pic:nvPicPr>
+                    <pic:cNvPr id="36" name="Picture 3"/>
+                    <pic:cNvPicPr>
+                      <a:picLocks noChangeAspect="1"/>
+                    </pic:cNvPicPr>
+                  </pic:nvPicPr>
+                  <pic:blipFill>
+                    <a:blip r:embed="rId29"/>
+                    <a:stretch>
+                      <a:fillRect/>
+                    </a:stretch>
+                  </pic:blipFill>
+                  <pic:spPr>
+                    <a:xfrm>
+                      <a:off x="0" y="0"/>
+                      <a:ext cx="5938520" cy="405130"/>
+                    </a:xfrm>
+                    <a:prstGeom prst="rect">
+                      <a:avLst/>
+                    </a:prstGeom>
+                    <a:noFill/>
+                    <a:ln>
+                      <a:noFill/>
+                    </a:ln>
+                  </pic:spPr>
+                </pic:pic>
+              </a:graphicData>
+            </a:graphic>
+          </wp:inline>
+        </w:drawing>
+      </w:r>
+    </w:p>
+    <w:p>
+      <w:pPr>
+        <w:numPr>
+          <w:ilvl w:val="0"/>
+          <w:numId w:val="0"/>
+        </w:numPr>
+        <w:tabs>
+          <w:tab w:val="left" w:pos="432"/>
+        </w:tabs>
+        <w:spacing w:before="160" w:after="80" w:line="240" w:lineRule="auto"/>
         <w:jc w:val="both"/>
+        <w:rPr>
+          <w:rFonts w:hint="default" w:ascii="Cambria" w:hAnsi="Cambria" w:cs="Cambria"/>
+          <w:sz w:val="32"/>
+          <w:szCs w:val="32"/>
+          <w:lang w:val="en-CA"/>
+        </w:rPr>
+      </w:pPr>
+    </w:p>
+    <w:p>
+      <w:pPr>
+        <w:numPr>
+          <w:ilvl w:val="0"/>
+          <w:numId w:val="21"/>
+        </w:numPr>
+        <w:spacing w:before="160" w:after="80" w:line="240" w:lineRule="auto"/>
+        <w:ind w:left="432" w:leftChars="0" w:hanging="432" w:firstLineChars="0"/>
+        <w:jc w:val="center"/>
         <w:rPr>
           <w:rFonts w:hint="default" w:ascii="Cambria" w:hAnsi="Cambria" w:cs="Cambria"/>
           <w:b/>
@@ -4594,12 +4822,44 @@
           <w:lang w:val="en-CA"/>
         </w:rPr>
       </w:pPr>
-    </w:p>
-    <w:p>
-      <w:pPr>
-        <w:numPr>
-          <w:ilvl w:val="0"/>
-          <w:numId w:val="24"/>
+      <w:r>
+        <w:rPr>
+          <w:rFonts w:hint="default" w:ascii="Cambria" w:hAnsi="Cambria" w:cs="Cambria"/>
+          <w:b/>
+          <w:bCs/>
+          <w:sz w:val="44"/>
+          <w:szCs w:val="44"/>
+          <w:lang w:val="en-CA"/>
+        </w:rPr>
+        <w:t>(Introductiontompi,Lecture3Slide90)</w:t>
+      </w:r>
+    </w:p>
+    <w:p>
+      <w:pPr>
+        <w:numPr>
+          <w:ilvl w:val="0"/>
+          <w:numId w:val="0"/>
+        </w:numPr>
+        <w:tabs>
+          <w:tab w:val="left" w:pos="432"/>
+        </w:tabs>
+        <w:spacing w:before="160" w:after="80" w:line="240" w:lineRule="auto"/>
+        <w:jc w:val="both"/>
+        <w:rPr>
+          <w:rFonts w:hint="default" w:ascii="Cambria" w:hAnsi="Cambria" w:cs="Cambria"/>
+          <w:b/>
+          <w:bCs/>
+          <w:sz w:val="44"/>
+          <w:szCs w:val="44"/>
+          <w:lang w:val="en-CA"/>
+        </w:rPr>
+      </w:pPr>
+    </w:p>
+    <w:p>
+      <w:pPr>
+        <w:numPr>
+          <w:ilvl w:val="0"/>
+          <w:numId w:val="26"/>
         </w:numPr>
         <w:tabs>
           <w:tab w:val="left" w:pos="432"/>
@@ -4633,7 +4893,7 @@
       <w:pPr>
         <w:numPr>
           <w:ilvl w:val="0"/>
-          <w:numId w:val="24"/>
+          <w:numId w:val="26"/>
         </w:numPr>
         <w:tabs>
           <w:tab w:val="left" w:pos="432"/>
@@ -4667,7 +4927,7 @@
       <w:pPr>
         <w:numPr>
           <w:ilvl w:val="1"/>
-          <w:numId w:val="24"/>
+          <w:numId w:val="26"/>
         </w:numPr>
         <w:tabs>
           <w:tab w:val="left" w:pos="432"/>
@@ -4701,7 +4961,7 @@
       <w:pPr>
         <w:numPr>
           <w:ilvl w:val="1"/>
-          <w:numId w:val="24"/>
+          <w:numId w:val="26"/>
         </w:numPr>
         <w:tabs>
           <w:tab w:val="left" w:pos="432"/>
@@ -4735,7 +4995,7 @@
       <w:pPr>
         <w:numPr>
           <w:ilvl w:val="1"/>
-          <w:numId w:val="24"/>
+          <w:numId w:val="26"/>
         </w:numPr>
         <w:tabs>
           <w:tab w:val="left" w:pos="432"/>
@@ -4769,7 +5029,7 @@
       <w:pPr>
         <w:numPr>
           <w:ilvl w:val="0"/>
-          <w:numId w:val="25"/>
+          <w:numId w:val="27"/>
         </w:numPr>
         <w:tabs>
           <w:tab w:val="left" w:pos="432"/>
@@ -4803,7 +5063,7 @@
       <w:pPr>
         <w:numPr>
           <w:ilvl w:val="0"/>
-          <w:numId w:val="25"/>
+          <w:numId w:val="27"/>
         </w:numPr>
         <w:tabs>
           <w:tab w:val="left" w:pos="432"/>
@@ -4837,7 +5097,7 @@
       <w:pPr>
         <w:numPr>
           <w:ilvl w:val="0"/>
-          <w:numId w:val="25"/>
+          <w:numId w:val="27"/>
         </w:numPr>
         <w:tabs>
           <w:tab w:val="left" w:pos="432"/>
@@ -4874,7 +5134,7 @@
                     </pic:cNvPicPr>
                   </pic:nvPicPr>
                   <pic:blipFill>
-                    <a:blip r:embed="rId28"/>
+                    <a:blip r:embed="rId30"/>
                     <a:stretch>
                       <a:fillRect/>
                     </a:stretch>
@@ -4902,6 +5162,7 @@
     <w:p>
       <w:pPr>
         <w:numPr>
+          <w:ilvl w:val="0"/>
           <w:numId w:val="0"/>
         </w:numPr>
         <w:tabs>
@@ -4929,7 +5190,7 @@
                     </pic:cNvPicPr>
                   </pic:nvPicPr>
                   <pic:blipFill>
-                    <a:blip r:embed="rId29"/>
+                    <a:blip r:embed="rId31"/>
                     <a:stretch>
                       <a:fillRect/>
                     </a:stretch>
@@ -4958,7 +5219,7 @@
       <w:pPr>
         <w:numPr>
           <w:ilvl w:val="0"/>
-          <w:numId w:val="25"/>
+          <w:numId w:val="27"/>
         </w:numPr>
         <w:tabs>
           <w:tab w:val="left" w:pos="432"/>
@@ -4987,6 +5248,7 @@
     <w:p>
       <w:pPr>
         <w:numPr>
+          <w:ilvl w:val="0"/>
           <w:numId w:val="0"/>
         </w:numPr>
         <w:tabs>
@@ -5006,7 +5268,7 @@
       <w:pPr>
         <w:numPr>
           <w:ilvl w:val="0"/>
-          <w:numId w:val="25"/>
+          <w:numId w:val="27"/>
         </w:numPr>
         <w:tabs>
           <w:tab w:val="left" w:pos="432"/>
@@ -5036,7 +5298,7 @@
       <w:pPr>
         <w:numPr>
           <w:ilvl w:val="1"/>
-          <w:numId w:val="25"/>
+          <w:numId w:val="27"/>
         </w:numPr>
         <w:tabs>
           <w:tab w:val="left" w:pos="432"/>
@@ -5066,7 +5328,7 @@
       <w:pPr>
         <w:numPr>
           <w:ilvl w:val="1"/>
-          <w:numId w:val="25"/>
+          <w:numId w:val="27"/>
         </w:numPr>
         <w:tabs>
           <w:tab w:val="left" w:pos="432"/>
@@ -5101,7 +5363,7 @@
                     </pic:cNvPicPr>
                   </pic:nvPicPr>
                   <pic:blipFill>
-                    <a:blip r:embed="rId30"/>
+                    <a:blip r:embed="rId32"/>
                     <a:stretch>
                       <a:fillRect/>
                     </a:stretch>
@@ -5130,7 +5392,7 @@
       <w:pPr>
         <w:numPr>
           <w:ilvl w:val="1"/>
-          <w:numId w:val="25"/>
+          <w:numId w:val="27"/>
         </w:numPr>
         <w:tabs>
           <w:tab w:val="left" w:pos="432"/>
@@ -5165,7 +5427,7 @@
                     </pic:cNvPicPr>
                   </pic:nvPicPr>
                   <pic:blipFill>
-                    <a:blip r:embed="rId31"/>
+                    <a:blip r:embed="rId33"/>
                     <a:stretch>
                       <a:fillRect/>
                     </a:stretch>
@@ -5194,7 +5456,7 @@
       <w:pPr>
         <w:numPr>
           <w:ilvl w:val="1"/>
-          <w:numId w:val="25"/>
+          <w:numId w:val="27"/>
         </w:numPr>
         <w:tabs>
           <w:tab w:val="left" w:pos="432"/>
@@ -5243,6 +5505,7 @@
     <w:p>
       <w:pPr>
         <w:numPr>
+          <w:ilvl w:val="0"/>
           <w:numId w:val="0"/>
         </w:numPr>
         <w:tabs>
@@ -5261,6 +5524,7 @@
     <w:p>
       <w:pPr>
         <w:numPr>
+          <w:ilvl w:val="0"/>
           <w:numId w:val="0"/>
         </w:numPr>
         <w:tabs>
@@ -5280,7 +5544,7 @@
       <w:pPr>
         <w:numPr>
           <w:ilvl w:val="0"/>
-          <w:numId w:val="26"/>
+          <w:numId w:val="28"/>
         </w:numPr>
         <w:tabs>
           <w:tab w:val="left" w:pos="432"/>
@@ -5310,7 +5574,7 @@
       <w:pPr>
         <w:numPr>
           <w:ilvl w:val="1"/>
-          <w:numId w:val="26"/>
+          <w:numId w:val="28"/>
         </w:numPr>
         <w:tabs>
           <w:tab w:val="left" w:pos="432"/>
@@ -5339,6 +5603,7 @@
     <w:p>
       <w:pPr>
         <w:numPr>
+          <w:ilvl w:val="0"/>
           <w:numId w:val="0"/>
         </w:numPr>
         <w:tabs>
@@ -5367,7 +5632,7 @@
                     </pic:cNvPicPr>
                   </pic:nvPicPr>
                   <pic:blipFill>
-                    <a:blip r:embed="rId32"/>
+                    <a:blip r:embed="rId34"/>
                     <a:stretch>
                       <a:fillRect/>
                     </a:stretch>
@@ -5395,6 +5660,7 @@
     <w:p>
       <w:pPr>
         <w:numPr>
+          <w:ilvl w:val="0"/>
           <w:numId w:val="0"/>
         </w:numPr>
         <w:tabs>
@@ -5423,7 +5689,7 @@
                     </pic:cNvPicPr>
                   </pic:nvPicPr>
                   <pic:blipFill>
-                    <a:blip r:embed="rId33"/>
+                    <a:blip r:embed="rId35"/>
                     <a:stretch>
                       <a:fillRect/>
                     </a:stretch>
@@ -5451,6 +5717,7 @@
     <w:p>
       <w:pPr>
         <w:numPr>
+          <w:ilvl w:val="0"/>
           <w:numId w:val="0"/>
         </w:numPr>
         <w:tabs>
@@ -5479,7 +5746,7 @@
                     </pic:cNvPicPr>
                   </pic:nvPicPr>
                   <pic:blipFill>
-                    <a:blip r:embed="rId34"/>
+                    <a:blip r:embed="rId36"/>
                     <a:stretch>
                       <a:fillRect/>
                     </a:stretch>
@@ -5507,6 +5774,7 @@
     <w:p>
       <w:pPr>
         <w:numPr>
+          <w:ilvl w:val="0"/>
           <w:numId w:val="0"/>
         </w:numPr>
         <w:tabs>
@@ -5521,7 +5789,7 @@
       <w:pPr>
         <w:numPr>
           <w:ilvl w:val="0"/>
-          <w:numId w:val="27"/>
+          <w:numId w:val="29"/>
         </w:numPr>
         <w:tabs>
           <w:tab w:val="left" w:pos="432"/>
@@ -5550,6 +5818,7 @@
     <w:p>
       <w:pPr>
         <w:numPr>
+          <w:ilvl w:val="0"/>
           <w:numId w:val="0"/>
         </w:numPr>
         <w:tabs>
@@ -5570,7 +5839,7 @@
       <w:pPr>
         <w:numPr>
           <w:ilvl w:val="1"/>
-          <w:numId w:val="27"/>
+          <w:numId w:val="29"/>
         </w:numPr>
         <w:tabs>
           <w:tab w:val="left" w:pos="432"/>
@@ -5600,7 +5869,7 @@
       <w:pPr>
         <w:numPr>
           <w:ilvl w:val="1"/>
-          <w:numId w:val="27"/>
+          <w:numId w:val="29"/>
         </w:numPr>
         <w:tabs>
           <w:tab w:val="left" w:pos="432"/>
@@ -5635,7 +5904,7 @@
                     </pic:cNvPicPr>
                   </pic:nvPicPr>
                   <pic:blipFill>
-                    <a:blip r:embed="rId35"/>
+                    <a:blip r:embed="rId37"/>
                     <a:stretch>
                       <a:fillRect/>
                     </a:stretch>
@@ -5664,7 +5933,7 @@
       <w:pPr>
         <w:numPr>
           <w:ilvl w:val="1"/>
-          <w:numId w:val="27"/>
+          <w:numId w:val="29"/>
         </w:numPr>
         <w:tabs>
           <w:tab w:val="left" w:pos="432"/>
@@ -5699,7 +5968,7 @@
                     </pic:cNvPicPr>
                   </pic:nvPicPr>
                   <pic:blipFill>
-                    <a:blip r:embed="rId36"/>
+                    <a:blip r:embed="rId38"/>
                     <a:stretch>
                       <a:fillRect/>
                     </a:stretch>
@@ -5728,7 +5997,7 @@
       <w:pPr>
         <w:numPr>
           <w:ilvl w:val="1"/>
-          <w:numId w:val="27"/>
+          <w:numId w:val="29"/>
         </w:numPr>
         <w:tabs>
           <w:tab w:val="left" w:pos="432"/>
@@ -5763,7 +6032,7 @@
                     </pic:cNvPicPr>
                   </pic:nvPicPr>
                   <pic:blipFill>
-                    <a:blip r:embed="rId37"/>
+                    <a:blip r:embed="rId39"/>
                     <a:stretch>
                       <a:fillRect/>
                     </a:stretch>
@@ -5792,7 +6061,7 @@
       <w:pPr>
         <w:numPr>
           <w:ilvl w:val="1"/>
-          <w:numId w:val="27"/>
+          <w:numId w:val="29"/>
         </w:numPr>
         <w:tabs>
           <w:tab w:val="left" w:pos="432"/>
@@ -5827,7 +6096,7 @@
                     </pic:cNvPicPr>
                   </pic:nvPicPr>
                   <pic:blipFill>
-                    <a:blip r:embed="rId38"/>
+                    <a:blip r:embed="rId40"/>
                     <a:stretch>
                       <a:fillRect/>
                     </a:stretch>
@@ -5851,8 +6120,6 @@
           </wp:inline>
         </w:drawing>
       </w:r>
-      <w:bookmarkStart w:id="0" w:name="_GoBack"/>
-      <w:bookmarkEnd w:id="0"/>
     </w:p>
     <w:p>
       <w:pPr>
@@ -6639,6 +6906,26 @@
     </w:lvl>
   </w:abstractNum>
   <w:abstractNum w:abstractNumId="7">
+    <w:nsid w:val="AE043C9E"/>
+    <w:multiLevelType w:val="singleLevel"/>
+    <w:tmpl w:val="AE043C9E"/>
+    <w:lvl w:ilvl="0" w:tentative="0">
+      <w:start w:val="1"/>
+      <w:numFmt w:val="bullet"/>
+      <w:lvlText w:val=""/>
+      <w:lvlJc w:val="left"/>
+      <w:pPr>
+        <w:tabs>
+          <w:tab w:val="left" w:pos="420"/>
+        </w:tabs>
+        <w:ind w:left="420" w:leftChars="0" w:hanging="420" w:firstLineChars="0"/>
+      </w:pPr>
+      <w:rPr>
+        <w:rFonts w:hint="default" w:ascii="Wingdings" w:hAnsi="Wingdings"/>
+      </w:rPr>
+    </w:lvl>
+  </w:abstractNum>
+  <w:abstractNum w:abstractNumId="8">
     <w:nsid w:val="BCC47A12"/>
     <w:multiLevelType w:val="singleLevel"/>
     <w:tmpl w:val="BCC47A12"/>
@@ -6658,7 +6945,7 @@
       </w:rPr>
     </w:lvl>
   </w:abstractNum>
-  <w:abstractNum w:abstractNumId="8">
+  <w:abstractNum w:abstractNumId="9">
     <w:nsid w:val="BECA299B"/>
     <w:multiLevelType w:val="multilevel"/>
     <w:tmpl w:val="BECA299B"/>
@@ -6798,7 +7085,7 @@
       </w:rPr>
     </w:lvl>
   </w:abstractNum>
-  <w:abstractNum w:abstractNumId="9">
+  <w:abstractNum w:abstractNumId="10">
     <w:nsid w:val="C72154F8"/>
     <w:multiLevelType w:val="singleLevel"/>
     <w:tmpl w:val="C72154F8"/>
@@ -6818,7 +7105,7 @@
       </w:rPr>
     </w:lvl>
   </w:abstractNum>
-  <w:abstractNum w:abstractNumId="10">
+  <w:abstractNum w:abstractNumId="11">
     <w:nsid w:val="C8034077"/>
     <w:multiLevelType w:val="multilevel"/>
     <w:tmpl w:val="C8034077"/>
@@ -6958,7 +7245,7 @@
       </w:rPr>
     </w:lvl>
   </w:abstractNum>
-  <w:abstractNum w:abstractNumId="11">
+  <w:abstractNum w:abstractNumId="12">
     <w:nsid w:val="D1797C0C"/>
     <w:multiLevelType w:val="singleLevel"/>
     <w:tmpl w:val="D1797C0C"/>
@@ -6978,7 +7265,7 @@
       </w:rPr>
     </w:lvl>
   </w:abstractNum>
-  <w:abstractNum w:abstractNumId="12">
+  <w:abstractNum w:abstractNumId="13">
     <w:nsid w:val="D1A00078"/>
     <w:multiLevelType w:val="multilevel"/>
     <w:tmpl w:val="D1A00078"/>
@@ -7118,7 +7405,7 @@
       </w:rPr>
     </w:lvl>
   </w:abstractNum>
-  <w:abstractNum w:abstractNumId="13">
+  <w:abstractNum w:abstractNumId="14">
     <w:nsid w:val="D508F405"/>
     <w:multiLevelType w:val="singleLevel"/>
     <w:tmpl w:val="D508F405"/>
@@ -7138,7 +7425,7 @@
       </w:rPr>
     </w:lvl>
   </w:abstractNum>
-  <w:abstractNum w:abstractNumId="14">
+  <w:abstractNum w:abstractNumId="15">
     <w:nsid w:val="DB936096"/>
     <w:multiLevelType w:val="singleLevel"/>
     <w:tmpl w:val="DB936096"/>
@@ -7158,7 +7445,27 @@
       </w:rPr>
     </w:lvl>
   </w:abstractNum>
-  <w:abstractNum w:abstractNumId="15">
+  <w:abstractNum w:abstractNumId="16">
+    <w:nsid w:val="EAA6AC2B"/>
+    <w:multiLevelType w:val="singleLevel"/>
+    <w:tmpl w:val="EAA6AC2B"/>
+    <w:lvl w:ilvl="0" w:tentative="0">
+      <w:start w:val="8"/>
+      <w:numFmt w:val="decimal"/>
+      <w:lvlText w:val="%1)"/>
+      <w:lvlJc w:val="left"/>
+      <w:pPr>
+        <w:tabs>
+          <w:tab w:val="left" w:pos="852"/>
+        </w:tabs>
+        <w:ind w:left="852" w:leftChars="0" w:hanging="432" w:firstLineChars="0"/>
+      </w:pPr>
+      <w:rPr>
+        <w:rFonts w:hint="default"/>
+      </w:rPr>
+    </w:lvl>
+  </w:abstractNum>
+  <w:abstractNum w:abstractNumId="17">
     <w:nsid w:val="EEE27554"/>
     <w:multiLevelType w:val="multilevel"/>
     <w:tmpl w:val="EEE27554"/>
@@ -7298,7 +7605,7 @@
       </w:rPr>
     </w:lvl>
   </w:abstractNum>
-  <w:abstractNum w:abstractNumId="16">
+  <w:abstractNum w:abstractNumId="18">
     <w:nsid w:val="F12EF51E"/>
     <w:multiLevelType w:val="singleLevel"/>
     <w:tmpl w:val="F12EF51E"/>
@@ -7318,7 +7625,7 @@
       </w:rPr>
     </w:lvl>
   </w:abstractNum>
-  <w:abstractNum w:abstractNumId="17">
+  <w:abstractNum w:abstractNumId="19">
     <w:nsid w:val="F5454A1C"/>
     <w:multiLevelType w:val="multilevel"/>
     <w:tmpl w:val="F5454A1C"/>
@@ -7458,7 +7765,7 @@
       </w:rPr>
     </w:lvl>
   </w:abstractNum>
-  <w:abstractNum w:abstractNumId="18">
+  <w:abstractNum w:abstractNumId="20">
     <w:nsid w:val="124B4870"/>
     <w:multiLevelType w:val="multilevel"/>
     <w:tmpl w:val="124B4870"/>
@@ -7598,7 +7905,7 @@
       </w:rPr>
     </w:lvl>
   </w:abstractNum>
-  <w:abstractNum w:abstractNumId="19">
+  <w:abstractNum w:abstractNumId="21">
     <w:nsid w:val="24E3E5AE"/>
     <w:multiLevelType w:val="singleLevel"/>
     <w:tmpl w:val="24E3E5AE"/>
@@ -7618,7 +7925,7 @@
       </w:rPr>
     </w:lvl>
   </w:abstractNum>
-  <w:abstractNum w:abstractNumId="20">
+  <w:abstractNum w:abstractNumId="22">
     <w:nsid w:val="30387E52"/>
     <w:multiLevelType w:val="singleLevel"/>
     <w:tmpl w:val="30387E52"/>
@@ -7638,7 +7945,7 @@
       </w:rPr>
     </w:lvl>
   </w:abstractNum>
-  <w:abstractNum w:abstractNumId="21">
+  <w:abstractNum w:abstractNumId="23">
     <w:nsid w:val="48DD248C"/>
     <w:multiLevelType w:val="multilevel"/>
     <w:tmpl w:val="48DD248C"/>
@@ -7724,7 +8031,7 @@
       </w:pPr>
     </w:lvl>
   </w:abstractNum>
-  <w:abstractNum w:abstractNumId="22">
+  <w:abstractNum w:abstractNumId="24">
     <w:nsid w:val="5B302BE9"/>
     <w:multiLevelType w:val="multilevel"/>
     <w:tmpl w:val="5B302BE9"/>
@@ -7864,7 +8171,7 @@
       </w:rPr>
     </w:lvl>
   </w:abstractNum>
-  <w:abstractNum w:abstractNumId="23">
+  <w:abstractNum w:abstractNumId="25">
     <w:nsid w:val="6962CE74"/>
     <w:multiLevelType w:val="singleLevel"/>
     <w:tmpl w:val="6962CE74"/>
@@ -7884,7 +8191,7 @@
       </w:rPr>
     </w:lvl>
   </w:abstractNum>
-  <w:abstractNum w:abstractNumId="24">
+  <w:abstractNum w:abstractNumId="26">
     <w:nsid w:val="6CC9D2AC"/>
     <w:multiLevelType w:val="multilevel"/>
     <w:tmpl w:val="6CC9D2AC"/>
@@ -7970,7 +8277,7 @@
       </w:pPr>
     </w:lvl>
   </w:abstractNum>
-  <w:abstractNum w:abstractNumId="25">
+  <w:abstractNum w:abstractNumId="27">
     <w:nsid w:val="74026BD9"/>
     <w:multiLevelType w:val="singleLevel"/>
     <w:tmpl w:val="74026BD9"/>
@@ -7990,7 +8297,7 @@
       </w:rPr>
     </w:lvl>
   </w:abstractNum>
-  <w:abstractNum w:abstractNumId="26">
+  <w:abstractNum w:abstractNumId="28">
     <w:nsid w:val="7579365C"/>
     <w:multiLevelType w:val="singleLevel"/>
     <w:tmpl w:val="7579365C"/>
@@ -8011,10 +8318,10 @@
     </w:lvl>
   </w:abstractNum>
   <w:num w:numId="1">
-    <w:abstractNumId w:val="21"/>
+    <w:abstractNumId w:val="23"/>
   </w:num>
   <w:num w:numId="2">
-    <w:abstractNumId w:val="24"/>
+    <w:abstractNumId w:val="26"/>
   </w:num>
   <w:num w:numId="3">
     <w:abstractNumId w:val="6"/>
@@ -8023,37 +8330,37 @@
     <w:abstractNumId w:val="0"/>
   </w:num>
   <w:num w:numId="5">
-    <w:abstractNumId w:val="9"/>
+    <w:abstractNumId w:val="10"/>
   </w:num>
   <w:num w:numId="6">
     <w:abstractNumId w:val="5"/>
   </w:num>
   <w:num w:numId="7">
-    <w:abstractNumId w:val="12"/>
+    <w:abstractNumId w:val="13"/>
   </w:num>
   <w:num w:numId="8">
-    <w:abstractNumId w:val="19"/>
+    <w:abstractNumId w:val="21"/>
   </w:num>
   <w:num w:numId="9">
-    <w:abstractNumId w:val="7"/>
+    <w:abstractNumId w:val="8"/>
   </w:num>
   <w:num w:numId="10">
+    <w:abstractNumId w:val="20"/>
+  </w:num>
+  <w:num w:numId="11">
     <w:abstractNumId w:val="18"/>
   </w:num>
-  <w:num w:numId="11">
-    <w:abstractNumId w:val="16"/>
-  </w:num>
   <w:num w:numId="12">
-    <w:abstractNumId w:val="26"/>
+    <w:abstractNumId w:val="28"/>
   </w:num>
   <w:num w:numId="13">
-    <w:abstractNumId w:val="23"/>
+    <w:abstractNumId w:val="25"/>
   </w:num>
   <w:num w:numId="14">
-    <w:abstractNumId w:val="14"/>
+    <w:abstractNumId w:val="15"/>
   </w:num>
   <w:num w:numId="15">
-    <w:abstractNumId w:val="17"/>
+    <w:abstractNumId w:val="19"/>
   </w:num>
   <w:num w:numId="16">
     <w:abstractNumId w:val="3"/>
@@ -8062,34 +8369,40 @@
     <w:abstractNumId w:val="1"/>
   </w:num>
   <w:num w:numId="18">
-    <w:abstractNumId w:val="11"/>
+    <w:abstractNumId w:val="12"/>
   </w:num>
   <w:num w:numId="19">
     <w:abstractNumId w:val="2"/>
   </w:num>
   <w:num w:numId="20">
-    <w:abstractNumId w:val="20"/>
+    <w:abstractNumId w:val="22"/>
   </w:num>
   <w:num w:numId="21">
-    <w:abstractNumId w:val="25"/>
+    <w:abstractNumId w:val="27"/>
   </w:num>
   <w:num w:numId="22">
-    <w:abstractNumId w:val="10"/>
+    <w:abstractNumId w:val="11"/>
   </w:num>
   <w:num w:numId="23">
-    <w:abstractNumId w:val="13"/>
+    <w:abstractNumId w:val="14"/>
   </w:num>
   <w:num w:numId="24">
-    <w:abstractNumId w:val="8"/>
+    <w:abstractNumId w:val="16"/>
   </w:num>
   <w:num w:numId="25">
+    <w:abstractNumId w:val="7"/>
+  </w:num>
+  <w:num w:numId="26">
+    <w:abstractNumId w:val="9"/>
+  </w:num>
+  <w:num w:numId="27">
     <w:abstractNumId w:val="4"/>
   </w:num>
-  <w:num w:numId="26">
-    <w:abstractNumId w:val="22"/>
+  <w:num w:numId="28">
+    <w:abstractNumId w:val="24"/>
   </w:num>
-  <w:num w:numId="27">
-    <w:abstractNumId w:val="15"/>
+  <w:num w:numId="29">
+    <w:abstractNumId w:val="17"/>
   </w:num>
 </w:numbering>
 </file>
@@ -9381,23 +9694,12 @@
 </file>
 
 <file path=customXml/item1.xml><?xml version="1.0" encoding="utf-8"?>
-<p:properties xmlns:p="http://schemas.microsoft.com/office/2006/metadata/properties" xmlns:xsi="http://www.w3.org/2001/XMLSchema-instance" xmlns:pc="http://schemas.microsoft.com/office/infopath/2007/PartnerControls">
-  <documentManagement>
-    <Background xmlns="71af3243-3dd4-4a8d-8c0d-dd76da1f02a5">false</Background>
-    <Status xmlns="71af3243-3dd4-4a8d-8c0d-dd76da1f02a5">Not started</Status>
-    <_ip_UnifiedCompliancePolicyUIAction xmlns="http://schemas.microsoft.com/sharepoint/v3" xsi:nil="true"/>
-    <Image xmlns="71af3243-3dd4-4a8d-8c0d-dd76da1f02a5">
-      <Url xsi:nil="true"/>
-      <Description xsi:nil="true"/>
-    </Image>
-    <_ip_UnifiedCompliancePolicyProperties xmlns="http://schemas.microsoft.com/sharepoint/v3" xsi:nil="true"/>
-    <ImageTagsTaxHTField xmlns="71af3243-3dd4-4a8d-8c0d-dd76da1f02a5">
-      <Terms xmlns="http://schemas.microsoft.com/office/infopath/2007/PartnerControls"/>
-    </ImageTagsTaxHTField>
-    <TaxCatchAll xmlns="230e9df3-be65-4c73-a93b-d1236ebd677e" xsi:nil="true"/>
-    <MediaServiceKeyPoints xmlns="71af3243-3dd4-4a8d-8c0d-dd76da1f02a5" xsi:nil="true"/>
-  </documentManagement>
-</p:properties>
+<?mso-contentType ?>
+<FormTemplates xmlns="http://schemas.microsoft.com/sharepoint/v3/contenttype/forms">
+  <Display>DocumentLibraryForm</Display>
+  <Edit>DocumentLibraryForm</Edit>
+  <New>DocumentLibraryForm</New>
+</FormTemplates>
 </file>
 
 <file path=customXml/item2.xml><?xml version="1.0" encoding="utf-8"?>
@@ -9719,16 +10021,27 @@
 </file>
 
 <file path=customXml/item3.xml><?xml version="1.0" encoding="utf-8"?>
-<?mso-contentType ?>
-<FormTemplates xmlns="http://schemas.microsoft.com/sharepoint/v3/contenttype/forms">
-  <Display>DocumentLibraryForm</Display>
-  <Edit>DocumentLibraryForm</Edit>
-  <New>DocumentLibraryForm</New>
-</FormTemplates>
+<p:properties xmlns:p="http://schemas.microsoft.com/office/2006/metadata/properties" xmlns:xsi="http://www.w3.org/2001/XMLSchema-instance" xmlns:pc="http://schemas.microsoft.com/office/infopath/2007/PartnerControls">
+  <documentManagement>
+    <Background xmlns="71af3243-3dd4-4a8d-8c0d-dd76da1f02a5">false</Background>
+    <Status xmlns="71af3243-3dd4-4a8d-8c0d-dd76da1f02a5">Not started</Status>
+    <_ip_UnifiedCompliancePolicyUIAction xmlns="http://schemas.microsoft.com/sharepoint/v3" xsi:nil="true"/>
+    <Image xmlns="71af3243-3dd4-4a8d-8c0d-dd76da1f02a5">
+      <Url xsi:nil="true"/>
+      <Description xsi:nil="true"/>
+    </Image>
+    <_ip_UnifiedCompliancePolicyProperties xmlns="http://schemas.microsoft.com/sharepoint/v3" xsi:nil="true"/>
+    <ImageTagsTaxHTField xmlns="71af3243-3dd4-4a8d-8c0d-dd76da1f02a5">
+      <Terms xmlns="http://schemas.microsoft.com/office/infopath/2007/PartnerControls"/>
+    </ImageTagsTaxHTField>
+    <TaxCatchAll xmlns="230e9df3-be65-4c73-a93b-d1236ebd677e" xsi:nil="true"/>
+    <MediaServiceKeyPoints xmlns="71af3243-3dd4-4a8d-8c0d-dd76da1f02a5" xsi:nil="true"/>
+  </documentManagement>
+</p:properties>
 </file>
 
 <file path=customXml/itemProps1.xml><?xml version="1.0" encoding="utf-8"?>
-<ds:datastoreItem xmlns:ds="http://schemas.openxmlformats.org/officeDocument/2006/customXml" ds:itemID="{C2D76B08-176C-4BDB-90D6-0C430F180BB8}">
+<ds:datastoreItem xmlns:ds="http://schemas.openxmlformats.org/officeDocument/2006/customXml" ds:itemID="{324330ED-517D-44B3-A43E-15DF31B51B6D}">
   <ds:schemaRefs/>
 </ds:datastoreItem>
 </file>
@@ -9740,7 +10053,7 @@
 </file>
 
 <file path=customXml/itemProps3.xml><?xml version="1.0" encoding="utf-8"?>
-<ds:datastoreItem xmlns:ds="http://schemas.openxmlformats.org/officeDocument/2006/customXml" ds:itemID="{324330ED-517D-44B3-A43E-15DF31B51B6D}">
+<ds:datastoreItem xmlns:ds="http://schemas.openxmlformats.org/officeDocument/2006/customXml" ds:itemID="{C2D76B08-176C-4BDB-90D6-0C430F180BB8}">
   <ds:schemaRefs/>
 </ds:datastoreItem>
 </file>
</xml_diff>